<commit_message>
docs: 說明書補上 SSH config 對應/known_hosts 管理，版本資訊補 v1.2.0
</commit_message>
<xml_diff>
--- a/Key_Management/KeyManagement_說明書.docx
+++ b/Key_Management/KeyManagement_說明書.docx
@@ -45,7 +45,7 @@
           <w:sz w:val="20"/>
           <w:szCs w:val="20"/>
         </w:rPr>
-        <w:t xml:space="preserve">版本：v1.1.0　最後更新：2026-07-11</w:t>
+        <w:t xml:space="preserve">版本：v1.2.0　最後更新：2026-07-16</w:t>
       </w:r>
     </w:p>
     <w:p>
@@ -310,7 +310,7 @@
               <w:rPr>
                 <w:rFonts w:ascii="Microsoft JhengHei" w:cs="Microsoft JhengHei" w:eastAsia="Microsoft JhengHei" w:hAnsi="Microsoft JhengHei"/>
               </w:rPr>
-              <w:t xml:space="preserve">呼叫本機 ssh-keygen，可選 ed25519／rsa／ecdsa，可設定位元數、Comment、密碼。</w:t>
+              <w:t xml:space="preserve">呼叫本機 ssh-keygen，可選 ed25519／rsa／ecdsa，可設定位元數、Comment、密碼；可勾選「同時寫入 SSH config」，填 Host 別名／HostName／User 就自動附加設定區塊，之後用 ssh &lt;別名&gt; 就會自動用這把金鑰，別名衝突時不會覆蓋、只會回報。</w:t>
             </w:r>
           </w:p>
         </w:tc>
@@ -689,6 +689,114 @@
                 <w:rFonts w:ascii="Microsoft JhengHei" w:cs="Microsoft JhengHei" w:eastAsia="Microsoft JhengHei" w:hAnsi="Microsoft JhengHei"/>
               </w:rPr>
               <w:t xml:space="preserve">匯出報表為 CSV；是否包含私鑰原始內容由使用者當下選擇，預設不包含。</w:t>
+            </w:r>
+          </w:p>
+        </w:tc>
+      </w:tr>
+      <w:tr>
+        <w:tc>
+          <w:tcPr>
+            <w:tcW w:type="dxa" w:w="2400"/>
+            <w:tcBorders>
+              <w:top w:val="single" w:color="CCCCCC" w:sz="1"/>
+              <w:left w:val="single" w:color="CCCCCC" w:sz="1"/>
+              <w:bottom w:val="single" w:color="CCCCCC" w:sz="1"/>
+              <w:right w:val="single" w:color="CCCCCC" w:sz="1"/>
+            </w:tcBorders>
+            <w:tcMar>
+              <w:top w:type="dxa" w:w="80"/>
+              <w:left w:type="dxa" w:w="120"/>
+              <w:bottom w:type="dxa" w:w="80"/>
+              <w:right w:type="dxa" w:w="120"/>
+            </w:tcMar>
+            <w:vAlign w:val="center"/>
+          </w:tcPr>
+          <w:p>
+            <w:r>
+              <w:rPr>
+                <w:rFonts w:ascii="Microsoft JhengHei" w:cs="Microsoft JhengHei" w:eastAsia="Microsoft JhengHei" w:hAnsi="Microsoft JhengHei"/>
+              </w:rPr>
+              <w:t xml:space="preserve">SSH config 對應</w:t>
+            </w:r>
+          </w:p>
+        </w:tc>
+        <w:tc>
+          <w:tcPr>
+            <w:tcW w:type="dxa" w:w="6960"/>
+            <w:tcBorders>
+              <w:top w:val="single" w:color="CCCCCC" w:sz="1"/>
+              <w:left w:val="single" w:color="CCCCCC" w:sz="1"/>
+              <w:bottom w:val="single" w:color="CCCCCC" w:sz="1"/>
+              <w:right w:val="single" w:color="CCCCCC" w:sz="1"/>
+            </w:tcBorders>
+            <w:tcMar>
+              <w:top w:type="dxa" w:w="80"/>
+              <w:left w:type="dxa" w:w="120"/>
+              <w:bottom w:type="dxa" w:w="80"/>
+              <w:right w:type="dxa" w:w="120"/>
+            </w:tcMar>
+            <w:vAlign w:val="center"/>
+          </w:tcPr>
+          <w:p>
+            <w:r>
+              <w:rPr>
+                <w:rFonts w:ascii="Microsoft JhengHei" w:cs="Microsoft JhengHei" w:eastAsia="Microsoft JhengHei" w:hAnsi="Microsoft JhengHei"/>
+              </w:rPr>
+              <w:t xml:space="preserve">解析 ~/.ssh/config，報表新增「SSH config Host」欄位，顯示每把私鑰實際設定給哪個 Host 別名用；產生新金鑰時也可選擇同時寫入設定。</w:t>
+            </w:r>
+          </w:p>
+        </w:tc>
+      </w:tr>
+      <w:tr>
+        <w:tc>
+          <w:tcPr>
+            <w:tcW w:type="dxa" w:w="2400"/>
+            <w:tcBorders>
+              <w:top w:val="single" w:color="CCCCCC" w:sz="1"/>
+              <w:left w:val="single" w:color="CCCCCC" w:sz="1"/>
+              <w:bottom w:val="single" w:color="CCCCCC" w:sz="1"/>
+              <w:right w:val="single" w:color="CCCCCC" w:sz="1"/>
+            </w:tcBorders>
+            <w:tcMar>
+              <w:top w:type="dxa" w:w="80"/>
+              <w:left w:type="dxa" w:w="120"/>
+              <w:bottom w:type="dxa" w:w="80"/>
+              <w:right w:type="dxa" w:w="120"/>
+            </w:tcMar>
+            <w:vAlign w:val="center"/>
+          </w:tcPr>
+          <w:p>
+            <w:r>
+              <w:rPr>
+                <w:rFonts w:ascii="Microsoft JhengHei" w:cs="Microsoft JhengHei" w:eastAsia="Microsoft JhengHei" w:hAnsi="Microsoft JhengHei"/>
+              </w:rPr>
+              <w:t xml:space="preserve">known_hosts 管理</w:t>
+            </w:r>
+          </w:p>
+        </w:tc>
+        <w:tc>
+          <w:tcPr>
+            <w:tcW w:type="dxa" w:w="6960"/>
+            <w:tcBorders>
+              <w:top w:val="single" w:color="CCCCCC" w:sz="1"/>
+              <w:left w:val="single" w:color="CCCCCC" w:sz="1"/>
+              <w:bottom w:val="single" w:color="CCCCCC" w:sz="1"/>
+              <w:right w:val="single" w:color="CCCCCC" w:sz="1"/>
+            </w:tcBorders>
+            <w:tcMar>
+              <w:top w:type="dxa" w:w="80"/>
+              <w:left w:type="dxa" w:w="120"/>
+              <w:bottom w:type="dxa" w:w="80"/>
+              <w:right w:type="dxa" w:w="120"/>
+            </w:tcMar>
+            <w:vAlign w:val="center"/>
+          </w:tcPr>
+          <w:p>
+            <w:r>
+              <w:rPr>
+                <w:rFonts w:ascii="Microsoft JhengHei" w:cs="Microsoft JhengHei" w:eastAsia="Microsoft JhengHei" w:hAnsi="Microsoft JhengHei"/>
+              </w:rPr>
+              <w:t xml:space="preserve">檢視 ~/.ssh/known_hosts 所有紀錄，明碼主機名可偵測「同主機同金鑰類型」的真重複，雜湊過的主機名無法判斷；可刪除選取項目，刪除前自動備份原檔。</w:t>
             </w:r>
           </w:p>
         </w:tc>
@@ -1652,6 +1760,60 @@
               <w:rPr>
                 <w:rFonts w:ascii="Microsoft JhengHei" w:cs="Microsoft JhengHei" w:eastAsia="Microsoft JhengHei" w:hAnsi="Microsoft JhengHei"/>
               </w:rPr>
+              <w:t xml:space="preserve">SSH config Host</w:t>
+            </w:r>
+          </w:p>
+        </w:tc>
+        <w:tc>
+          <w:tcPr>
+            <w:tcW w:type="dxa" w:w="7160"/>
+            <w:tcBorders>
+              <w:top w:val="single" w:color="CCCCCC" w:sz="1"/>
+              <w:left w:val="single" w:color="CCCCCC" w:sz="1"/>
+              <w:bottom w:val="single" w:color="CCCCCC" w:sz="1"/>
+              <w:right w:val="single" w:color="CCCCCC" w:sz="1"/>
+            </w:tcBorders>
+            <w:tcMar>
+              <w:top w:type="dxa" w:w="80"/>
+              <w:left w:type="dxa" w:w="120"/>
+              <w:bottom w:type="dxa" w:w="80"/>
+              <w:right w:type="dxa" w:w="120"/>
+            </w:tcMar>
+            <w:vAlign w:val="center"/>
+          </w:tcPr>
+          <w:p>
+            <w:r>
+              <w:rPr>
+                <w:rFonts w:ascii="Microsoft JhengHei" w:cs="Microsoft JhengHei" w:eastAsia="Microsoft JhengHei" w:hAnsi="Microsoft JhengHei"/>
+              </w:rPr>
+              <w:t xml:space="preserve">解析 ~/.ssh/config（含 Match Host/User 語法）後，這把私鑰實際對應的 Host 別名；沒設定過就顯示「（未設定）」。讓報表從「這是什麼金鑰」進化成「這把金鑰實際連去哪」。</w:t>
+            </w:r>
+          </w:p>
+        </w:tc>
+      </w:tr>
+      <w:tr>
+        <w:tc>
+          <w:tcPr>
+            <w:tcW w:type="dxa" w:w="2200"/>
+            <w:tcBorders>
+              <w:top w:val="single" w:color="CCCCCC" w:sz="1"/>
+              <w:left w:val="single" w:color="CCCCCC" w:sz="1"/>
+              <w:bottom w:val="single" w:color="CCCCCC" w:sz="1"/>
+              <w:right w:val="single" w:color="CCCCCC" w:sz="1"/>
+            </w:tcBorders>
+            <w:tcMar>
+              <w:top w:type="dxa" w:w="80"/>
+              <w:left w:type="dxa" w:w="120"/>
+              <w:bottom w:type="dxa" w:w="80"/>
+              <w:right w:type="dxa" w:w="120"/>
+            </w:tcMar>
+            <w:vAlign w:val="center"/>
+          </w:tcPr>
+          <w:p>
+            <w:r>
+              <w:rPr>
+                <w:rFonts w:ascii="Microsoft JhengHei" w:cs="Microsoft JhengHei" w:eastAsia="Microsoft JhengHei" w:hAnsi="Microsoft JhengHei"/>
+              </w:rPr>
               <w:t xml:space="preserve">最後修改</w:t>
             </w:r>
           </w:p>
@@ -1931,7 +2093,7 @@
               <w:rPr>
                 <w:rFonts w:ascii="Microsoft JhengHei" w:cs="Microsoft JhengHei" w:eastAsia="Microsoft JhengHei" w:hAnsi="Microsoft JhengHei"/>
               </w:rPr>
-              <w:t xml:space="preserve">不需要先選取。可指定類型（ed25519/rsa/ecdsa）、位元數、檔名、儲存資料夾、Comment、密碼。已存在的檔名會拒絕覆蓋。產生完成後會自動重新掃描。</w:t>
+              <w:t xml:space="preserve">不需要先選取。可指定類型（ed25519/rsa/ecdsa）、位元數、檔名、儲存資料夾、Comment、密碼。已存在的檔名會拒絕覆蓋。可勾選「同時寫入 SSH config」（填 Host 別名／HostName／User），產生成功後自動附加一段設定，別名衝突就不寫、只回報，不會覆蓋既有設定。產生完成後會自動重新掃描。</w:t>
             </w:r>
           </w:p>
         </w:tc>
@@ -2327,6 +2489,33 @@
           <w:bCs w:val="false"/>
         </w:rPr>
         <w:t xml:space="preserve">檢視本機所有管理動作的紀錄，包含產生、封存、永久刪除、備份、還原、檢視私鑰原始內容、匯出報表等，每筆都有時間戳記。檔案位置：~/.key_management/audit.log。</w:t>
+      </w:r>
+    </w:p>
+    <w:p>
+      <w:pPr>
+        <w:pStyle w:val="Heading2"/>
+        <w:spacing w:after="120"/>
+      </w:pPr>
+      <w:r>
+        <w:rPr>
+          <w:rFonts w:ascii="Microsoft JhengHei" w:cs="Microsoft JhengHei" w:eastAsia="Microsoft JhengHei" w:hAnsi="Microsoft JhengHei"/>
+          <w:b w:val="false"/>
+          <w:bCs w:val="false"/>
+        </w:rPr>
+        <w:t xml:space="preserve">5.3 known_hosts 管理…</w:t>
+      </w:r>
+    </w:p>
+    <w:p>
+      <w:pPr>
+        <w:spacing w:after="120"/>
+      </w:pPr>
+      <w:r>
+        <w:rPr>
+          <w:rFonts w:ascii="Microsoft JhengHei" w:cs="Microsoft JhengHei" w:eastAsia="Microsoft JhengHei" w:hAnsi="Microsoft JhengHei"/>
+          <w:b w:val="false"/>
+          <w:bCs w:val="false"/>
+        </w:rPr>
+        <w:t xml:space="preserve">列出 ~/.ssh/known_hosts 的每一筆紀錄（主機名／類型）。主機名有雜湊過的話（OpenSSH 預設的 HashKnownHosts 行為）會顯示「（已雜湊，看不出主機名）」，這種沒辦法判斷是否重複；只有明碼主機名，才會在「同一台主機、同一種金鑰類型」出現超過一次時標記 ⚠ 重複（同主機有不同金鑰類型是正常現象，不會誤標）。選一筆按「刪除選取…」可移除，刪除前會先把整個檔案備份一份（檔名帶時間戳）。</w:t>
       </w:r>
     </w:p>
     <w:p>
@@ -2660,6 +2849,60 @@
                 <w:rFonts w:ascii="Microsoft JhengHei" w:cs="Microsoft JhengHei" w:eastAsia="Microsoft JhengHei" w:hAnsi="Microsoft JhengHei"/>
               </w:rPr>
               <w:t xml:space="preserve">主視窗改成啟動時自動貼合螢幕可用區域（showMaximized），不用再每次手動點最大化。</w:t>
+            </w:r>
+          </w:p>
+        </w:tc>
+      </w:tr>
+      <w:tr>
+        <w:tc>
+          <w:tcPr>
+            <w:tcW w:type="dxa" w:w="3200"/>
+            <w:tcBorders>
+              <w:top w:val="single" w:color="CCCCCC" w:sz="1"/>
+              <w:left w:val="single" w:color="CCCCCC" w:sz="1"/>
+              <w:bottom w:val="single" w:color="CCCCCC" w:sz="1"/>
+              <w:right w:val="single" w:color="CCCCCC" w:sz="1"/>
+            </w:tcBorders>
+            <w:tcMar>
+              <w:top w:type="dxa" w:w="80"/>
+              <w:left w:type="dxa" w:w="120"/>
+              <w:bottom w:type="dxa" w:w="80"/>
+              <w:right w:type="dxa" w:w="120"/>
+            </w:tcMar>
+            <w:vAlign w:val="center"/>
+          </w:tcPr>
+          <w:p>
+            <w:r>
+              <w:rPr>
+                <w:rFonts w:ascii="Microsoft JhengHei" w:cs="Microsoft JhengHei" w:eastAsia="Microsoft JhengHei" w:hAnsi="Microsoft JhengHei"/>
+              </w:rPr>
+              <w:t xml:space="preserve">v1.2.0（2026-07-16）</w:t>
+            </w:r>
+          </w:p>
+        </w:tc>
+        <w:tc>
+          <w:tcPr>
+            <w:tcW w:type="dxa" w:w="6160"/>
+            <w:tcBorders>
+              <w:top w:val="single" w:color="CCCCCC" w:sz="1"/>
+              <w:left w:val="single" w:color="CCCCCC" w:sz="1"/>
+              <w:bottom w:val="single" w:color="CCCCCC" w:sz="1"/>
+              <w:right w:val="single" w:color="CCCCCC" w:sz="1"/>
+            </w:tcBorders>
+            <w:tcMar>
+              <w:top w:type="dxa" w:w="80"/>
+              <w:left w:type="dxa" w:w="120"/>
+              <w:bottom w:type="dxa" w:w="80"/>
+              <w:right w:type="dxa" w:w="120"/>
+            </w:tcMar>
+            <w:vAlign w:val="center"/>
+          </w:tcPr>
+          <w:p>
+            <w:r>
+              <w:rPr>
+                <w:rFonts w:ascii="Microsoft JhengHei" w:cs="Microsoft JhengHei" w:eastAsia="Microsoft JhengHei" w:hAnsi="Microsoft JhengHei"/>
+              </w:rPr>
+              <w:t xml:space="preserve">新增 SSH config 解析（報表顯示每把私鑰對應的 Host 別名，產生金鑰時可選擇同時寫入設定）；新增 known_hosts 管理（檢視、偵測明碼主機的真重複、刪除並自動備份）。</w:t>
             </w:r>
           </w:p>
         </w:tc>

</xml_diff>

<commit_message>
feat: 跨機器同步身份設定與金鑰名冊；NasGitConnector v2.5.0、KeyManagement v1.3.0
單人多台電腦（家中／公司）情境下，兩支工具過去都是每台機器各自獨立：

NasGitConnector：
- 「☁ 同步跨機器設定」按鈕（profile_sync_pull/push Worker mode）：把身份設定
  （user/host/remote_root，不含密碼、不含 identity_file 這兩個機器本地欄位）
  同步到 NAS 上 config/profiles_sync.json，任一台電腦新增/修改過的身份，
  其他電腦按一下就能拉回來。合併規則：updated_at 較新的贏，machines
  （電腦名稱綁定清單）一律聯集只加不減。

Key_Management（新增本工具第一次、且僅有的網路能力，選用、預設不啟用）：
- 「⚙ 雲端同步設定…」：設定 NAS 連線資訊（只支援 SSH 金鑰登入），可從
  NasGitConnector 的身份設定一鍵帶入，不用重複輸入。
- 「🌐 跨電腦金鑰總覽…」+ sync_registry Worker mode：把金鑰名冊的中繼資料
  （指紋/備註/類型/時間戳/看過的電腦）同步到 NAS 上
  config/km_registry_sync.json，私鑰檔案內容本身永遠不會被讀取或上傳。
- 既有的金鑰年齡提醒／重複金鑰偵測（build_advisories）延伸為跨機器範圍：
  同步過之後，掃描報表就能看出同一把金鑰是否也存在於其他電腦。

兩份 CLAUDE.md 補上新增的雙向唯讀耦合說明（NasGitConnector 讀 Key_Management
的 registry.json；Key_Management 讀 NasGitConnector 的 QSettings）。

版本 bump：nas_git_connector.py 2.4.7→2.5.0、key_management.py 1.2.3→1.3.0，
两份說明書封面版號與內容同步更新，dist/ 下已重新建置對應版號 exe。
</commit_message>
<xml_diff>
--- a/Key_Management/KeyManagement_說明書.docx
+++ b/Key_Management/KeyManagement_說明書.docx
@@ -45,7 +45,7 @@
           <w:sz w:val="20"/>
           <w:szCs w:val="20"/>
         </w:rPr>
-        <w:t xml:space="preserve">版本：v1.2.3　最後更新：2026-07-16</w:t>
+        <w:t xml:space="preserve">版本：v1.3.0　最後更新：2026-07-22</w:t>
       </w:r>
     </w:p>
     <w:p>
@@ -2520,6 +2520,33 @@
     </w:p>
     <w:p>
       <w:pPr>
+        <w:pStyle w:val="Heading2"/>
+        <w:spacing w:after="120"/>
+      </w:pPr>
+      <w:r>
+        <w:rPr>
+          <w:rFonts w:ascii="Microsoft JhengHei" w:cs="Microsoft JhengHei" w:eastAsia="Microsoft JhengHei" w:hAnsi="Microsoft JhengHei"/>
+          <w:b w:val="false"/>
+          <w:bCs w:val="false"/>
+        </w:rPr>
+        <w:t xml:space="preserve">5.4 跨機器同步（選用）</w:t>
+      </w:r>
+    </w:p>
+    <w:p>
+      <w:pPr>
+        <w:spacing w:after="120"/>
+      </w:pPr>
+      <w:r>
+        <w:rPr>
+          <w:rFonts w:ascii="Microsoft JhengHei" w:cs="Microsoft JhengHei" w:eastAsia="Microsoft JhengHei" w:hAnsi="Microsoft JhengHei"/>
+          <w:b w:val="false"/>
+          <w:bCs w:val="false"/>
+        </w:rPr>
+        <w:t xml:space="preserve">給一個人用多台電腦（家中／公司等）的情境：「⚙ 雲端同步設定…」設定 NAS 連線資訊（NAS 主機／SSH 使用者／Git_Server 根／私鑰檔案，只支援 SSH 金鑰登入，不支援密碼；有裝 NasGitConnector 的話可按「從 NasGitConnector 帶入…」一鍵帶入，不用重複輸入）。設定完成後按「🌐 跨電腦金鑰總覽…」再按「🔄 立即同步」：會把本機金鑰名冊的中繼資料（指紋／備註／類型／時間戳／看過它的電腦名稱）跟 NAS 上其他電腦已同步過的資料合併（同一把鑰匙依較新的紀錄為準，「看過的電腦」清單只加不減），合併結果同時存回本機並推回 NAS。私鑰檔案內容本身在整個同步流程裡完全不會被讀取或上傳。同步過之後，之後每次「開始掃描」報表的「建議」欄位就能看出：這把金鑰是否也存在於其他電腦（可能是刻意複製，也可能是忘記的舊拷貝），跟既有的「金鑰年齡提醒」「重複金鑰偵測」一樣顯示在同一欄，只是範圍從單機延伸到所有已同步過的電腦。</w:t>
+      </w:r>
+    </w:p>
+    <w:p>
+      <w:pPr>
         <w:pStyle w:val="Heading1"/>
         <w:spacing w:after="120"/>
       </w:pPr>
@@ -3065,6 +3092,60 @@
                 <w:rFonts w:ascii="Microsoft JhengHei" w:cs="Microsoft JhengHei" w:eastAsia="Microsoft JhengHei" w:hAnsi="Microsoft JhengHei"/>
               </w:rPr>
               <w:t xml:space="preserve">實際踩雷後修正：「同時寫入 SSH config」以前只會寫傳統 Host 別名區塊，但 NasGitConnector 等工具一律用 ssh user@主機 直接連線、從不打別名，導致同一主機給多帳號共用時這功能形同虛設。改成 User 欄位有填時寫 Match originalhost 主機 user 帳號 區塊，不用打別名就自動生效；User 留空才維持舊的 Host 別名寫法。</w:t>
+            </w:r>
+          </w:p>
+        </w:tc>
+      </w:tr>
+      <w:tr>
+        <w:tc>
+          <w:tcPr>
+            <w:tcW w:type="dxa" w:w="3200"/>
+            <w:tcBorders>
+              <w:top w:val="single" w:color="CCCCCC" w:sz="1"/>
+              <w:left w:val="single" w:color="CCCCCC" w:sz="1"/>
+              <w:bottom w:val="single" w:color="CCCCCC" w:sz="1"/>
+              <w:right w:val="single" w:color="CCCCCC" w:sz="1"/>
+            </w:tcBorders>
+            <w:tcMar>
+              <w:top w:type="dxa" w:w="80"/>
+              <w:left w:type="dxa" w:w="120"/>
+              <w:bottom w:type="dxa" w:w="80"/>
+              <w:right w:type="dxa" w:w="120"/>
+            </w:tcMar>
+            <w:vAlign w:val="center"/>
+          </w:tcPr>
+          <w:p>
+            <w:r>
+              <w:rPr>
+                <w:rFonts w:ascii="Microsoft JhengHei" w:cs="Microsoft JhengHei" w:eastAsia="Microsoft JhengHei" w:hAnsi="Microsoft JhengHei"/>
+              </w:rPr>
+              <w:t xml:space="preserve">v1.3.0（2026-07-22）</w:t>
+            </w:r>
+          </w:p>
+        </w:tc>
+        <w:tc>
+          <w:tcPr>
+            <w:tcW w:type="dxa" w:w="6160"/>
+            <w:tcBorders>
+              <w:top w:val="single" w:color="CCCCCC" w:sz="1"/>
+              <w:left w:val="single" w:color="CCCCCC" w:sz="1"/>
+              <w:bottom w:val="single" w:color="CCCCCC" w:sz="1"/>
+              <w:right w:val="single" w:color="CCCCCC" w:sz="1"/>
+            </w:tcBorders>
+            <w:tcMar>
+              <w:top w:type="dxa" w:w="80"/>
+              <w:left w:type="dxa" w:w="120"/>
+              <w:bottom w:type="dxa" w:w="80"/>
+              <w:right w:type="dxa" w:w="120"/>
+            </w:tcMar>
+            <w:vAlign w:val="center"/>
+          </w:tcPr>
+          <w:p>
+            <w:r>
+              <w:rPr>
+                <w:rFonts w:ascii="Microsoft JhengHei" w:cs="Microsoft JhengHei" w:eastAsia="Microsoft JhengHei" w:hAnsi="Microsoft JhengHei"/>
+              </w:rPr>
+              <w:t xml:space="preserve">新增「跨機器同步」（選用，預設不啟用）：新增「⚙ 雲端同步設定…」設定 NAS 連線資訊（只支援 SSH 金鑰登入，可從 NasGitConnector 的身份設定一鍵帶入）；新增「🌐 跨電腦金鑰總覽…」可一次看到所有已同步電腦的金鑰現況並手動觸發同步。同步只上傳金鑰名冊的中繼資料（指紋／備註／類型／時間戳／看過它的電腦名稱），私鑰檔案內容本身永遠不會被讀取或上傳。既有的「金鑰年齡提醒」「重複金鑰偵測」延伸為跨機器：只要同步過，掃描報表就能看出同一把金鑰是否也存在於其他電腦。</w:t>
             </w:r>
           </w:p>
         </w:tc>

</xml_diff>

<commit_message>
feat: exe 加上 Windows 版本資源（NGC 2.12.3 / KM 1.9.1）
以前打包出來的 exe 內部完全沒有版本資源——右鍵→內容→詳細資料的
FileVersion/ProductVersion 在每一顆歷史版本上都是空白。版本只存在於檔名，
而檔名是 build_exe.bat 的 copy 產生的，跟 exe 內容沒有任何強制關聯：抓錯檔、
複製那步出錯，都看不出來。這跟 2026-07-22 那次「版號複製靜默失敗」是同一個
問題的兩面（那次是檔名沒產生但建置成功，這次是檔名有了但內容無從驗證）。

- 兩份 get_version.py 加 --version-file 模式，從原始碼的 __version__ 直接產生
  PyInstaller 版本資源；無參數時行為完全不變（只印版本號），因為 batch 的
  for /f 靠那個輸出，多印任何東西都會壞掉
- 兩支 build_exe.bat 產生 version_info.txt 並以 --version-file 帶給 PyInstaller，
  產生失敗就中止建置而不是繼續打包一顆沒版號的 exe
- version_info.txt 每次建置重新產生，加進 .gitignore
- 兩套測試各補 TestVersionResource：read_version 與模組 __version__ 必須一致、
  版本字串轉四段整數、產生出來的檔案要能 compile（PyInstaller 是 eval 它的，
  語法錯會拖到建置最後一刻才炸）

實測兩顆 exe：
  NasGitConnector.exe  FileVersion='2.12.3' ProductVersion='2.12.3'
  KeyManagement.exe    FileVersion='1.9.1'  ProductVersion='1.9.1'

兩本說明書封面版號同步，KM 版本資訊表補 v1.9.1 一列、封面日期更新。

Co-Authored-By: Claude Opus 5 (1M context) <noreply@anthropic.com>
</commit_message>
<xml_diff>
--- a/Key_Management/KeyManagement_說明書.docx
+++ b/Key_Management/KeyManagement_說明書.docx
@@ -45,7 +45,7 @@
           <w:sz w:val="20"/>
           <w:szCs w:val="20"/>
         </w:rPr>
-        <w:t>版本：v1.9.0　最後更新：2026-07-22</w:t>
+        <w:t>版本：v1.9.1　最後更新：2026-08-14</w:t>
       </w:r>
     </w:p>
     <w:p>
@@ -3540,6 +3540,60 @@
                 <w:rFonts w:ascii="Microsoft JhengHei" w:cs="Microsoft JhengHei" w:eastAsia="Microsoft JhengHei" w:hAnsi="Microsoft JhengHei"/>
               </w:rPr>
               <w:t xml:space="preserve">修正跨機器同步會互相覆蓋的問題：以前推送完會把 NAS 上的名冊檔鎖成只有推送者讀得到，兩台電腦如果用不同的 SSH 身份同步，另一台就讀不到；而拉取端又把「檔案不存在」與「檔案讀不到」當成同一件事（都視為遠端是空的），於是合併等於沒合併，接著把只有自己資料的版本推回去蓋掉對方，畫面上還是回報同步成功。現在推送會把檔案設成群組可讀寫，拉取讀不到會直接中止同步並告訴你該下哪一行指令，成功訊息也會實際列出這次涵蓋了哪幾台電腦（只列出一台就是同步沒生效）。新增「掃描後自動同步」勾選，兩台電腦各按一次「開始掃描」就夠，先後順序無所謂。另修正私鑰權限檢查呼叫 icacls 時未指定編碼，在 UTF-8 模式下會炸掉整趟掃描的問題。</w:t>
+            </w:r>
+          </w:p>
+        </w:tc>
+      </w:tr>
+      <w:tr>
+        <w:tc>
+          <w:tcPr>
+            <w:tcW w:type="dxa" w:w="3200"/>
+            <w:tcBorders>
+              <w:top w:val="single" w:color="CCCCCC" w:sz="1"/>
+              <w:left w:val="single" w:color="CCCCCC" w:sz="1"/>
+              <w:bottom w:val="single" w:color="CCCCCC" w:sz="1"/>
+              <w:right w:val="single" w:color="CCCCCC" w:sz="1"/>
+            </w:tcBorders>
+            <w:tcMar>
+              <w:top w:type="dxa" w:w="80"/>
+              <w:left w:type="dxa" w:w="120"/>
+              <w:bottom w:type="dxa" w:w="80"/>
+              <w:right w:type="dxa" w:w="120"/>
+            </w:tcMar>
+            <w:vAlign w:val="center"/>
+          </w:tcPr>
+          <w:p>
+            <w:r>
+              <w:rPr>
+                <w:rFonts w:ascii="Microsoft JhengHei" w:cs="Microsoft JhengHei" w:eastAsia="Microsoft JhengHei" w:hAnsi="Microsoft JhengHei"/>
+              </w:rPr>
+              <w:t xml:space="preserve">v1.9.1（2026-08-14）</w:t>
+            </w:r>
+          </w:p>
+        </w:tc>
+        <w:tc>
+          <w:tcPr>
+            <w:tcW w:type="dxa" w:w="6160"/>
+            <w:tcBorders>
+              <w:top w:val="single" w:color="CCCCCC" w:sz="1"/>
+              <w:left w:val="single" w:color="CCCCCC" w:sz="1"/>
+              <w:bottom w:val="single" w:color="CCCCCC" w:sz="1"/>
+              <w:right w:val="single" w:color="CCCCCC" w:sz="1"/>
+            </w:tcBorders>
+            <w:tcMar>
+              <w:top w:type="dxa" w:w="80"/>
+              <w:left w:type="dxa" w:w="120"/>
+              <w:bottom w:type="dxa" w:w="80"/>
+              <w:right w:type="dxa" w:w="120"/>
+            </w:tcMar>
+            <w:vAlign w:val="center"/>
+          </w:tcPr>
+          <w:p>
+            <w:r>
+              <w:rPr>
+                <w:rFonts w:ascii="Microsoft JhengHei" w:cs="Microsoft JhengHei" w:eastAsia="Microsoft JhengHei" w:hAnsi="Microsoft JhengHei"/>
+              </w:rPr>
+              <w:t xml:space="preserve">建置流程加上 Windows 版本資源：以前打包出來的 exe 內部完全沒有版號，右鍵 → 內容 → 詳細資料的「檔案版本」「產品版本」都是空白，版本只存在於檔名，而檔名是建置指令複製出來的、跟 exe 內容沒有任何強制關聯，抓錯檔也看不出來。現在版本資源由 get_version.py 從原始碼的 __version__ 直接產生，檔案內容查得到真實版號，也不會跟程式裡的版號各走各的。</w:t>
             </w:r>
           </w:p>
         </w:tc>

</xml_diff>